<commit_message>
Semana 8: la amiga es de Cuba, no de un club de economía
Co-Authored-By: Claude Opus 5.5 <noreply@anthropic.com>
Claude-Session: https://claude.ai/code/session_01BtpjWnwVSgH2GWthk4WDfq
</commit_message>
<xml_diff>
--- a/tareas-semana/4-Week8-Reading.docx
+++ b/tareas-semana/4-Week8-Reading.docx
@@ -459,7 +459,7 @@
           <w:color w:val="000000"/>
           <w:sz w:val="24"/>
         </w:rPr>
-        <w:t xml:space="preserve">Oct. 4, a friend from my high school economics club.</w:t>
+        <w:t xml:space="preserve">Oct. 4, a friend of mine from Cuba.</w:t>
       </w:r>
       <w:r>
         <w:rPr>
@@ -699,7 +699,7 @@
           <w:color w:val="000000"/>
           <w:sz w:val="24"/>
         </w:rPr>
-        <w:t xml:space="preserve">I expected people to name math or my economics classes right away, because that is how I usually describe myself. Instead, the strength that came up most was how responsible I am with money: how I use it, how I help my family, and how I plan ahead. I was a little surprised that my mom and my friend answered with money at all, but when I thought about it, I have been handling money for my family and our business, and I never thought of that as something to say about myself. It makes finance feel like a natural fit, and I want to look at roles where that responsibility is part of the job.</w:t>
+        <w:t xml:space="preserve">I expected people to name math or school right away, because that is how I usually describe myself. Instead, the strength that came up most was how responsible I am with money: how I use it, how I help my family, and how I plan ahead. I was a little surprised that my mom and my friend answered with money at all, but when I thought about it, I have been handling money for my family and our business, and I never thought of that as something to say about myself. It makes finance feel like a natural fit, and I want to look at roles where that responsibility is part of the job.</w:t>
       </w:r>
     </w:p>
     <w:p>

</xml_diff>